<commit_message>
forgot to add swagger, added it toboth backend and report
</commit_message>
<xml_diff>
--- a/NAZIH_Youssef_Examen_JEE.docx
+++ b/NAZIH_Youssef_Examen_JEE.docx
@@ -24149,16 +24149,19 @@
         </w:numPr>
       </w:pPr>
       <w:r>
-        <w:t>Test du endpoint clients avec http IntelliJ</w:t>
+        <w:t xml:space="preserve">Test du endpoint clients avec </w:t>
+      </w:r>
+      <w:r>
+        <w:t>Swagger</w:t>
       </w:r>
     </w:p>
     <w:p>
       <w:r>
         <w:drawing>
-          <wp:inline distT="0" distB="0" distL="0" distR="0" wp14:anchorId="4D5CEFE5" wp14:editId="5773A277">
-            <wp:extent cx="5760720" cy="3103880"/>
-            <wp:effectExtent l="0" t="0" r="0" b="1270"/>
-            <wp:docPr id="928485836" name="Picture 1"/>
+          <wp:inline distT="0" distB="0" distL="0" distR="0" wp14:anchorId="5237AE7E" wp14:editId="0836B365">
+            <wp:extent cx="5760720" cy="2929890"/>
+            <wp:effectExtent l="0" t="0" r="0" b="3810"/>
+            <wp:docPr id="1174369113" name="Picture 1"/>
             <wp:cNvGraphicFramePr>
               <a:graphicFrameLocks xmlns:a="http://schemas.openxmlformats.org/drawingml/2006/main" noChangeAspect="1"/>
             </wp:cNvGraphicFramePr>
@@ -24166,7 +24169,7 @@
               <a:graphicData uri="http://schemas.openxmlformats.org/drawingml/2006/picture">
                 <pic:pic xmlns:pic="http://schemas.openxmlformats.org/drawingml/2006/picture">
                   <pic:nvPicPr>
-                    <pic:cNvPr id="928485836" name=""/>
+                    <pic:cNvPr id="1174369113" name=""/>
                     <pic:cNvPicPr/>
                   </pic:nvPicPr>
                   <pic:blipFill>
@@ -24178,7 +24181,7 @@
                   <pic:spPr>
                     <a:xfrm>
                       <a:off x="0" y="0"/>
-                      <a:ext cx="5760720" cy="3103880"/>
+                      <a:ext cx="5760720" cy="2929890"/>
                     </a:xfrm>
                     <a:prstGeom prst="rect">
                       <a:avLst/>
@@ -24718,7 +24721,7 @@
               <v:shape id="_x0000_i1025" type="#_x0000_t75" style="width:178pt;height:74.8pt">
                 <v:imagedata r:id="rId1" o:title=""/>
               </v:shape>
-              <o:OLEObject Type="Embed" ProgID="PBrush" ShapeID="_x0000_i1025" DrawAspect="Content" ObjectID="_1840005142" r:id="rId2"/>
+              <o:OLEObject Type="Embed" ProgID="PBrush" ShapeID="_x0000_i1025" DrawAspect="Content" ObjectID="_1840005414" r:id="rId2"/>
             </w:object>
           </w:r>
         </w:p>

</xml_diff>